<commit_message>
Removed .DS_Store, Update offer.docx template
</commit_message>
<xml_diff>
--- a/server/assets/templates/offer.docx
+++ b/server/assets/templates/offer.docx
@@ -725,11 +725,16 @@
     <w:p>
       <w:pPr>
         <w:pStyle w:val="Normal"/>
-        <w:spacing w:lineRule="auto" w:line="240"/>
-        <w:rPr/>
+        <w:spacing w:lineRule="auto" w:line="240" w:before="0" w:after="0"/>
+        <w:ind w:hanging="0" w:start="0"/>
+        <w:rPr>
+          <w:lang w:val="en-US"/>
+        </w:rPr>
       </w:pPr>
       <w:r>
-        <w:rPr/>
+        <w:rPr>
+          <w:lang w:val="en-US"/>
+        </w:rPr>
         <w:t>{customer.companyName}</w:t>
       </w:r>
     </w:p>
@@ -748,7 +753,8 @@
     <w:p>
       <w:pPr>
         <w:pStyle w:val="Normal"/>
-        <w:spacing w:lineRule="auto" w:line="240"/>
+        <w:spacing w:lineRule="auto" w:line="240" w:before="0" w:after="0"/>
+        <w:ind w:hanging="0" w:start="0"/>
         <w:rPr/>
       </w:pPr>
       <w:r>
@@ -1047,7 +1053,7 @@
         <w:pStyle w:val="PreformattedText"/>
         <w:numPr>
           <w:ilvl w:val="0"/>
-          <w:numId w:val="7"/>
+          <w:numId w:val="6"/>
         </w:numPr>
         <w:rPr>
           <w:rFonts w:ascii="Arial" w:hAnsi="Arial" w:eastAsia="Times New Roman" w:cs="Times New Roman"/>
@@ -1090,7 +1096,7 @@
       <w:pPr>
         <w:pStyle w:val="PreformattedText"/>
         <w:numPr>
-          <w:ilvl w:val="0"/>
+          <w:ilvl w:val="1"/>
           <w:numId w:val="6"/>
         </w:numPr>
         <w:rPr>
@@ -1107,17 +1113,16 @@
           <w:sz w:val="18"/>
           <w:szCs w:val="18"/>
         </w:rPr>
-        <w:t>{#features}{.}{/features}</w:t>
+        <w:t>{#features}</w:t>
       </w:r>
     </w:p>
     <w:p>
       <w:pPr>
         <w:pStyle w:val="PreformattedText"/>
         <w:numPr>
-          <w:ilvl w:val="0"/>
-          <w:numId w:val="0"/>
+          <w:ilvl w:val="1"/>
+          <w:numId w:val="6"/>
         </w:numPr>
-        <w:ind w:hanging="0" w:start="1429"/>
         <w:rPr>
           <w:rFonts w:ascii="Arial" w:hAnsi="Arial" w:eastAsia="Times New Roman" w:cs="Times New Roman"/>
           <w:color w:val="000000"/>
@@ -1132,23 +1137,16 @@
           <w:sz w:val="18"/>
           <w:szCs w:val="18"/>
         </w:rPr>
-        <w:t xml:space="preserve">Vertragslaufzeit: </w:t>
-      </w:r>
-      <w:r>
-        <w:rPr>
-          <w:rFonts w:eastAsia="Times New Roman" w:cs="Times New Roman" w:ascii="Arial" w:hAnsi="Arial"/>
-          <w:b/>
-          <w:bCs/>
-          <w:color w:val="000000"/>
-          <w:sz w:val="18"/>
-          <w:szCs w:val="18"/>
-        </w:rPr>
-        <w:t>{duration}</w:t>
+        <w:t>{.}</w:t>
       </w:r>
     </w:p>
     <w:p>
       <w:pPr>
         <w:pStyle w:val="PreformattedText"/>
+        <w:numPr>
+          <w:ilvl w:val="1"/>
+          <w:numId w:val="6"/>
+        </w:numPr>
         <w:rPr>
           <w:rFonts w:ascii="Arial" w:hAnsi="Arial" w:eastAsia="Times New Roman" w:cs="Times New Roman"/>
           <w:color w:val="000000"/>
@@ -1163,26 +1161,70 @@
           <w:sz w:val="18"/>
           <w:szCs w:val="18"/>
         </w:rPr>
-        <w:tab/>
+        <w:t>{/features}</w:t>
+      </w:r>
+    </w:p>
+    <w:p>
+      <w:pPr>
+        <w:pStyle w:val="dignumStandardvor0nach0"/>
+        <w:numPr>
+          <w:ilvl w:val="0"/>
+          <w:numId w:val="7"/>
+        </w:numPr>
+        <w:rPr/>
+      </w:pPr>
+      <w:r>
+        <w:rPr>
+          <w:b w:val="false"/>
+          <w:bCs w:val="false"/>
+        </w:rPr>
+        <w:t>Vertragslaufzeit:</w:t>
+      </w:r>
+      <w:r>
+        <w:rPr>
+          <w:b/>
+          <w:bCs/>
+        </w:rPr>
+        <w:t xml:space="preserve"> {duration}</w:t>
+      </w:r>
+    </w:p>
+    <w:p>
+      <w:pPr>
+        <w:pStyle w:val="dignumStandardvor0nach0"/>
+        <w:numPr>
+          <w:ilvl w:val="0"/>
+          <w:numId w:val="7"/>
+        </w:numPr>
+        <w:rPr>
+          <w:b w:val="false"/>
+          <w:bCs w:val="false"/>
+        </w:rPr>
+      </w:pPr>
+      <w:r>
+        <w:rPr>
+          <w:b w:val="false"/>
+          <w:bCs w:val="false"/>
+        </w:rPr>
         <w:t>Zahlungsweise: im Voraus</w:t>
       </w:r>
     </w:p>
     <w:p>
       <w:pPr>
-        <w:pStyle w:val="PreformattedText"/>
+        <w:pStyle w:val="dignumStandardvor0nach0"/>
+        <w:numPr>
+          <w:ilvl w:val="0"/>
+          <w:numId w:val="0"/>
+        </w:numPr>
+        <w:ind w:hanging="0" w:start="720"/>
         <w:rPr>
-          <w:rFonts w:ascii="Arial" w:hAnsi="Arial" w:eastAsia="Times New Roman" w:cs="Times New Roman"/>
-          <w:color w:val="000000"/>
-          <w:sz w:val="18"/>
-          <w:szCs w:val="18"/>
+          <w:b w:val="false"/>
+          <w:bCs w:val="false"/>
         </w:rPr>
       </w:pPr>
       <w:r>
         <w:rPr>
-          <w:rFonts w:eastAsia="Times New Roman" w:cs="Times New Roman" w:ascii="Arial" w:hAnsi="Arial"/>
-          <w:color w:val="000000"/>
-          <w:sz w:val="18"/>
-          <w:szCs w:val="18"/>
+          <w:b w:val="false"/>
+          <w:bCs w:val="false"/>
         </w:rPr>
       </w:r>
     </w:p>
@@ -5628,9 +5670,9 @@
       <w:lvlJc w:val="start"/>
       <w:pPr>
         <w:tabs>
-          <w:tab w:val="num" w:pos="1429"/>
+          <w:tab w:val="num" w:pos="720"/>
         </w:tabs>
-        <w:ind w:start="1429" w:hanging="360"/>
+        <w:ind w:start="720" w:hanging="360"/>
       </w:pPr>
       <w:rPr>
         <w:rFonts w:ascii="Symbol" w:hAnsi="Symbol" w:cs="Symbol" w:hint="default"/>
@@ -5643,9 +5685,9 @@
       <w:lvlJc w:val="start"/>
       <w:pPr>
         <w:tabs>
-          <w:tab w:val="num" w:pos="1789"/>
+          <w:tab w:val="num" w:pos="1080"/>
         </w:tabs>
-        <w:ind w:start="1789" w:hanging="360"/>
+        <w:ind w:start="1080" w:hanging="360"/>
       </w:pPr>
       <w:rPr>
         <w:rFonts w:ascii="OpenSymbol" w:hAnsi="OpenSymbol" w:cs="OpenSymbol" w:hint="default"/>
@@ -5658,9 +5700,9 @@
       <w:lvlJc w:val="start"/>
       <w:pPr>
         <w:tabs>
-          <w:tab w:val="num" w:pos="2149"/>
+          <w:tab w:val="num" w:pos="1440"/>
         </w:tabs>
-        <w:ind w:start="2149" w:hanging="360"/>
+        <w:ind w:start="1440" w:hanging="360"/>
       </w:pPr>
       <w:rPr>
         <w:rFonts w:ascii="OpenSymbol" w:hAnsi="OpenSymbol" w:cs="OpenSymbol" w:hint="default"/>
@@ -5673,9 +5715,9 @@
       <w:lvlJc w:val="start"/>
       <w:pPr>
         <w:tabs>
-          <w:tab w:val="num" w:pos="2509"/>
+          <w:tab w:val="num" w:pos="1800"/>
         </w:tabs>
-        <w:ind w:start="2509" w:hanging="360"/>
+        <w:ind w:start="1800" w:hanging="360"/>
       </w:pPr>
       <w:rPr>
         <w:rFonts w:ascii="Symbol" w:hAnsi="Symbol" w:cs="Symbol" w:hint="default"/>
@@ -5688,9 +5730,9 @@
       <w:lvlJc w:val="start"/>
       <w:pPr>
         <w:tabs>
-          <w:tab w:val="num" w:pos="2869"/>
+          <w:tab w:val="num" w:pos="2160"/>
         </w:tabs>
-        <w:ind w:start="2869" w:hanging="360"/>
+        <w:ind w:start="2160" w:hanging="360"/>
       </w:pPr>
       <w:rPr>
         <w:rFonts w:ascii="OpenSymbol" w:hAnsi="OpenSymbol" w:cs="OpenSymbol" w:hint="default"/>
@@ -5703,9 +5745,9 @@
       <w:lvlJc w:val="start"/>
       <w:pPr>
         <w:tabs>
-          <w:tab w:val="num" w:pos="3229"/>
+          <w:tab w:val="num" w:pos="2520"/>
         </w:tabs>
-        <w:ind w:start="3229" w:hanging="360"/>
+        <w:ind w:start="2520" w:hanging="360"/>
       </w:pPr>
       <w:rPr>
         <w:rFonts w:ascii="OpenSymbol" w:hAnsi="OpenSymbol" w:cs="OpenSymbol" w:hint="default"/>
@@ -5718,9 +5760,9 @@
       <w:lvlJc w:val="start"/>
       <w:pPr>
         <w:tabs>
-          <w:tab w:val="num" w:pos="3589"/>
+          <w:tab w:val="num" w:pos="2880"/>
         </w:tabs>
-        <w:ind w:start="3589" w:hanging="360"/>
+        <w:ind w:start="2880" w:hanging="360"/>
       </w:pPr>
       <w:rPr>
         <w:rFonts w:ascii="Symbol" w:hAnsi="Symbol" w:cs="Symbol" w:hint="default"/>
@@ -5733,9 +5775,9 @@
       <w:lvlJc w:val="start"/>
       <w:pPr>
         <w:tabs>
-          <w:tab w:val="num" w:pos="3949"/>
+          <w:tab w:val="num" w:pos="3240"/>
         </w:tabs>
-        <w:ind w:start="3949" w:hanging="360"/>
+        <w:ind w:start="3240" w:hanging="360"/>
       </w:pPr>
       <w:rPr>
         <w:rFonts w:ascii="OpenSymbol" w:hAnsi="OpenSymbol" w:cs="OpenSymbol" w:hint="default"/>
@@ -5748,9 +5790,9 @@
       <w:lvlJc w:val="start"/>
       <w:pPr>
         <w:tabs>
-          <w:tab w:val="num" w:pos="4309"/>
+          <w:tab w:val="num" w:pos="3600"/>
         </w:tabs>
-        <w:ind w:start="4309" w:hanging="360"/>
+        <w:ind w:start="3600" w:hanging="360"/>
       </w:pPr>
       <w:rPr>
         <w:rFonts w:ascii="OpenSymbol" w:hAnsi="OpenSymbol" w:cs="OpenSymbol" w:hint="default"/>
@@ -6679,8 +6721,8 @@
     <w:qFormat/>
     <w:rPr/>
   </w:style>
-  <w:style w:type="character" w:styleId="Bullets">
-    <w:name w:val="Bullets"/>
+  <w:style w:type="character" w:styleId="Bulletsuser">
+    <w:name w:val="Bullets (user)"/>
     <w:qFormat/>
     <w:rPr>
       <w:rFonts w:ascii="OpenSymbol" w:hAnsi="OpenSymbol" w:eastAsia="OpenSymbol" w:cs="OpenSymbol"/>
@@ -6699,8 +6741,8 @@
     <w:qFormat/>
     <w:rPr/>
   </w:style>
-  <w:style w:type="character" w:styleId="Bulletsuser">
-    <w:name w:val="Bullets (user)"/>
+  <w:style w:type="character" w:styleId="Bullets">
+    <w:name w:val="Bullets"/>
     <w:rPr>
       <w:rFonts w:ascii="OpenSymbol" w:hAnsi="OpenSymbol" w:eastAsia="OpenSymbol" w:cs="OpenSymbol"/>
     </w:rPr>
@@ -7288,8 +7330,8 @@
     </w:pPr>
     <w:rPr/>
   </w:style>
-  <w:style w:type="paragraph" w:styleId="FrameContents">
-    <w:name w:val="Frame Contents"/>
+  <w:style w:type="paragraph" w:styleId="FrameContentsuser">
+    <w:name w:val="Frame Contents (user)"/>
     <w:basedOn w:val="Normal"/>
     <w:qFormat/>
     <w:pPr/>
@@ -7315,8 +7357,8 @@
     <w:pPr/>
     <w:rPr/>
   </w:style>
-  <w:style w:type="paragraph" w:styleId="FrameContentsuser">
-    <w:name w:val="Frame Contents (user)"/>
+  <w:style w:type="paragraph" w:styleId="FrameContents">
+    <w:name w:val="Frame Contents"/>
     <w:basedOn w:val="Normal"/>
     <w:qFormat/>
     <w:pPr/>
@@ -7368,8 +7410,8 @@
     <w:name w:val="Nummerierung 123"/>
     <w:qFormat/>
   </w:style>
-  <w:style w:type="numbering" w:styleId="Bullet">
-    <w:name w:val="Bullet •"/>
+  <w:style w:type="numbering" w:styleId="Bulletuser">
+    <w:name w:val="Bullet • (user)"/>
     <w:qFormat/>
   </w:style>
   <w:style w:type="table" w:default="1" w:styleId="NormaleTabelle">

</xml_diff>